<commit_message>
Fix Word lists and PPT table merges found in visual tests.
python-docx ListBullet/ListNumber styles have no w:numPr, so bullets
were rendered as plain paragraphs. Floating images leaked into later
blocks via CSS float. PPT titles still fell back to concatenated table
text, and python-pptx writes gridSpan/hMerge on a:tc attributes.

Co-authored-by: EthanBird <EthanBird@users.noreply.github.com>
</commit_message>
<xml_diff>
--- a/public/office-fixtures/leafmark-sample.docx
+++ b/public/office-fixtures/leafmark-sample.docx
@@ -103,6 +103,38 @@
       </w:pPr>
       <w:r>
         <w:t>首屏只渲染可见内容</w:t>
+      </w:r>
+    </w:p>
+    <w:p>
+      <w:pPr>
+        <w:pStyle w:val="Heading2"/>
+      </w:pPr>
+      <w:r>
+        <w:t>检查顺序</w:t>
+      </w:r>
+    </w:p>
+    <w:p>
+      <w:pPr>
+        <w:pStyle w:val="ListNumber"/>
+      </w:pPr>
+      <w:r>
+        <w:t>先确认浮动图只环绕本段，不漏到标题和表格</w:t>
+      </w:r>
+    </w:p>
+    <w:p>
+      <w:pPr>
+        <w:pStyle w:val="ListNumber"/>
+      </w:pPr>
+      <w:r>
+        <w:t>再确认超链接是真实 URL，不是 rId</w:t>
+      </w:r>
+    </w:p>
+    <w:p>
+      <w:pPr>
+        <w:pStyle w:val="ListNumber"/>
+      </w:pPr>
+      <w:r>
+        <w:t>最后看合并表格的跨行跨列</w:t>
       </w:r>
     </w:p>
     <w:p>

</xml_diff>